<commit_message>
feat: depuracion total de N° y ordinales en plantillas, enmascaramiento confidencial de creditos/tarjetas y proteccion estricta de polizas
</commit_message>
<xml_diff>
--- a/plantillas_maestras/01_seguro_vehicular/anulacion_indebida/2_ddos_banco_y_aseguradora/varon/TPL_1015_2026_SEGURO_VEHICULAR_ANULACION_INDEBIDA_BANCO_VARON_R2.docx
+++ b/plantillas_maestras/01_seguro_vehicular/anulacion_indebida/2_ddos_banco_y_aseguradora/varon/TPL_1015_2026_SEGURO_VEHICULAR_ANULACION_INDEBIDA_BANCO_VARON_R2.docx
@@ -362,7 +362,7 @@
           <w14:ligatures w14:val="none"/>
         </w:rPr>
         <w:tab/>
-        <w:t xml:space="preserve">:       </w:t>
+        <w:t xml:space="preserve">: </w:t>
       </w:r>
       <w:r>
         <w:rPr>
@@ -738,7 +738,7 @@
           <w:lang w:val="es-ES" w:eastAsia="es-ES"/>
           <w14:ligatures w14:val="none"/>
         </w:rPr>
-        <w:t>por presuntas infracciones a la Ley N°29571, Código de Protección y</w:t>
+        <w:t>por presuntas infracciones a la Ley 29571, Código de Protección y</w:t>
       </w:r>
       <w:r>
         <w:rPr>
@@ -835,7 +835,7 @@
           <w:lang w:eastAsia="es-ES"/>
           <w14:ligatures w14:val="none"/>
         </w:rPr>
-        <w:t xml:space="preserve">El 10 de enero del 2022, suscribió un contrato de crédito vehicular N° CCV****8280 con el Banco, en cuyo acto se le indicó que el Seguro Vehicular </w:t>
+        <w:t xml:space="preserve">El 10 de enero del 2022, suscribió un contrato de crédito vehicular CCV****8280 con el Banco, en cuyo acto se le indicó que el Seguro Vehicular </w:t>
       </w:r>
       <w:r>
         <w:rPr>
@@ -1234,7 +1234,7 @@
           <w:lang w:eastAsia="es-ES"/>
           <w14:ligatures w14:val="none"/>
         </w:rPr>
-        <w:t xml:space="preserve">El 12 de febrero del 2026, presentó un reclamo ante el Instituto Nacional de Defensa de la Competencia y de la Protección de la Propiedad Intelectual, identificado como Reclamo N° 00005127-2026-SAC/RC, el cual fue puesto en conocimiento de </w:t>
+        <w:t xml:space="preserve">El 12 de febrero del 2026, presentó un reclamo ante el Instituto Nacional de Defensa de la Competencia y de la Protección de la Propiedad Intelectual, identificado como Reclamo 00005127-2026-SAC/RC, el cual fue puesto en conocimiento de </w:t>
       </w:r>
       <w:r>
         <w:rPr>
@@ -1399,7 +1399,7 @@
           <w:lang w:val="es-ES" w:eastAsia="es-ES"/>
           <w14:ligatures w14:val="none"/>
         </w:rPr>
-        <w:t xml:space="preserve">cumplan  con: (i) </w:t>
+        <w:t xml:space="preserve">cumplan con: (i) </w:t>
       </w:r>
       <w:r>
         <w:rPr>
@@ -1766,7 +1766,7 @@
           <w:lang w:eastAsia="es-PE"/>
           <w14:ligatures w14:val="none"/>
         </w:rPr>
-        <w:t>Técnica de la Comisión de Protección al Consumidor N°1 (en adelante, la Secretaría Técnica), en ejercicio de sus facultades</w:t>
+        <w:t>Técnica de la Comisión de Protección al Consumidor 1 (en adelante, la Secretaría Técnica), en ejercicio de sus facultades</w:t>
       </w:r>
       <w:r>
         <w:rPr>
@@ -1819,7 +1819,7 @@
           <w:lang w:val="es-ES" w:eastAsia="es-ES"/>
           <w14:ligatures w14:val="none"/>
         </w:rPr>
-        <w:t>Póliza del Seguro Vehicular asociado al crédito vehicular N° CCV****8280,</w:t>
+        <w:t>Póliza del Seguro Vehicular asociado al crédito vehicular CCV****8280,</w:t>
       </w:r>
       <w:r>
         <w:rPr>
@@ -1845,7 +1845,7 @@
           <w:lang w:eastAsia="es-PE"/>
           <w14:ligatures w14:val="none"/>
         </w:rPr>
-        <w:t>°</w:t>
+        <w:t/>
       </w:r>
       <w:r>
         <w:rPr>
@@ -1863,7 +1863,7 @@
           <w:lang w:eastAsia="es-PE"/>
           <w14:ligatures w14:val="none"/>
         </w:rPr>
-        <w:t>°</w:t>
+        <w:t/>
       </w:r>
       <w:r>
         <w:rPr>
@@ -2009,7 +2009,7 @@
           <w:lang w:val="es-ES" w:eastAsia="es-ES"/>
           <w14:ligatures w14:val="none"/>
         </w:rPr>
-        <w:t>Póliza del Seguro Vehicular asociado al crédito vehicular N° CCV****8280</w:t>
+        <w:t>Póliza del Seguro Vehicular asociado al crédito vehicular CCV****8280</w:t>
       </w:r>
       <w:r>
         <w:rPr>
@@ -2027,7 +2027,7 @@
           <w:lang w:eastAsia="es-PE"/>
           <w14:ligatures w14:val="none"/>
         </w:rPr>
-        <w:t>°</w:t>
+        <w:t/>
       </w:r>
       <w:r>
         <w:rPr>
@@ -2045,7 +2045,7 @@
           <w:lang w:eastAsia="es-PE"/>
           <w14:ligatures w14:val="none"/>
         </w:rPr>
-        <w:t>°</w:t>
+        <w:t/>
       </w:r>
       <w:r>
         <w:rPr>
@@ -2064,7 +2064,7 @@
           <w:lang w:eastAsia="es-PE"/>
           <w14:ligatures w14:val="none"/>
         </w:rPr>
-        <w:t xml:space="preserve">.  </w:t>
+        <w:t xml:space="preserve">. </w:t>
       </w:r>
     </w:p>
     <w:p>
@@ -2164,7 +2164,7 @@
           <w:lang w:val="es-ES" w:eastAsia="es-ES"/>
           <w14:ligatures w14:val="none"/>
         </w:rPr>
-        <w:t xml:space="preserve">Póliza del Seguro Vehicular asociado al crédito vehicular N° CCV****8280, </w:t>
+        <w:t xml:space="preserve">Póliza del Seguro Vehicular asociado al crédito vehicular CCV****8280, </w:t>
       </w:r>
       <w:r>
         <w:rPr>
@@ -2190,7 +2190,7 @@
           <w:lang w:eastAsia="es-PE"/>
           <w14:ligatures w14:val="none"/>
         </w:rPr>
-        <w:t>°</w:t>
+        <w:t/>
       </w:r>
       <w:r>
         <w:rPr>
@@ -2208,7 +2208,7 @@
           <w:lang w:eastAsia="es-PE"/>
           <w14:ligatures w14:val="none"/>
         </w:rPr>
-        <w:t>°</w:t>
+        <w:t/>
       </w:r>
       <w:r>
         <w:rPr>
@@ -2227,7 +2227,7 @@
           <w:lang w:eastAsia="es-PE"/>
           <w14:ligatures w14:val="none"/>
         </w:rPr>
-        <w:t xml:space="preserve">.  </w:t>
+        <w:t xml:space="preserve">. </w:t>
       </w:r>
     </w:p>
     <w:p>
@@ -2319,7 +2319,7 @@
           <w:lang w:val="es-ES" w:eastAsia="es-ES"/>
           <w14:ligatures w14:val="none"/>
         </w:rPr>
-        <w:t>Póliza del Seguro Vehicular asociado al crédito vehicular N° CCV****8280</w:t>
+        <w:t>Póliza del Seguro Vehicular asociado al crédito vehicular CCV****8280</w:t>
       </w:r>
       <w:r>
         <w:rPr>
@@ -2337,7 +2337,7 @@
           <w:lang w:eastAsia="es-PE"/>
           <w14:ligatures w14:val="none"/>
         </w:rPr>
-        <w:t>°</w:t>
+        <w:t/>
       </w:r>
       <w:r>
         <w:rPr>
@@ -2355,7 +2355,7 @@
           <w:lang w:eastAsia="es-PE"/>
           <w14:ligatures w14:val="none"/>
         </w:rPr>
-        <w:t>°</w:t>
+        <w:t/>
       </w:r>
       <w:r>
         <w:rPr>
@@ -2374,7 +2374,7 @@
           <w:lang w:eastAsia="es-PE"/>
           <w14:ligatures w14:val="none"/>
         </w:rPr>
-        <w:t xml:space="preserve">.  </w:t>
+        <w:t xml:space="preserve">. </w:t>
       </w:r>
     </w:p>
     <w:bookmarkEnd w:id="7"/>
@@ -2447,15 +2447,15 @@
           <w:lang w:val="es-ES" w:eastAsia="es-ES"/>
           <w14:ligatures w14:val="none"/>
         </w:rPr>
-        <w:t>la Póliza del Seguro Vehicular asociado al crédito vehicular N° CCV****8280</w:t>
-      </w:r>
-      <w:r>
-        <w:rPr>
-          <w:rFonts w:ascii="Arial Narrow" w:eastAsia="Arial Narrow" w:hAnsi="Arial Narrow" w:cs="Arial"/>
-          <w:kern w:val="0"/>
-          <w14:ligatures w14:val="none"/>
-        </w:rPr>
-        <w:t>. Por consiguiente, corresponde calificar el hecho materia de denuncia como una presunta infracción al deber de entregar a los usuarios copia de los contratos y demás documentación relacionada con dichos actos jurídicos, tipificado en el literal e) del artículo 47° del Código</w:t>
+        <w:t>la Póliza del Seguro Vehicular asociado al crédito vehicular CCV****8280</w:t>
+      </w:r>
+      <w:r>
+        <w:rPr>
+          <w:rFonts w:ascii="Arial Narrow" w:eastAsia="Arial Narrow" w:hAnsi="Arial Narrow" w:cs="Arial"/>
+          <w:kern w:val="0"/>
+          <w14:ligatures w14:val="none"/>
+        </w:rPr>
+        <w:t>. Por consiguiente, corresponde calificar el hecho materia de denuncia como una presunta infracción al deber de entregar a los usuarios copia de los contratos y demás documentación relacionada con dichos actos jurídicos, tipificado en el literal e) del artículo 47 del Código</w:t>
       </w:r>
       <w:r>
         <w:rPr>
@@ -2728,7 +2728,7 @@
           <w:lang w:val="es-ES" w:eastAsia="es-ES"/>
           <w14:ligatures w14:val="none"/>
         </w:rPr>
-        <w:t xml:space="preserve">Póliza del Seguro Vehicular asociado al crédito vehicular N° CCV****8280 </w:t>
+        <w:t xml:space="preserve">Póliza del Seguro Vehicular asociado al crédito vehicular CCV****8280 </w:t>
       </w:r>
       <w:r>
         <w:rPr>
@@ -2770,7 +2770,7 @@
           <w:lang w:val="es-ES" w:eastAsia="es-ES"/>
           <w14:ligatures w14:val="none"/>
         </w:rPr>
-        <w:t xml:space="preserve">) presentar los medios probatorios que acrediten que atendió oportunamente la solicitud de cancelación o sustitución de la Póliza del Seguro Vehicular asociado al crédito vehicular N° CCV****8280; </w:t>
+        <w:t xml:space="preserve">) presentar los medios probatorios que acrediten que atendió oportunamente la solicitud de cancelación o sustitución de la Póliza del Seguro Vehicular asociado al crédito vehicular CCV****8280; </w:t>
       </w:r>
       <w:r>
         <w:rPr>
@@ -2938,7 +2938,7 @@
           <w:lang w:val="es-ES" w:eastAsia="es-ES"/>
           <w14:ligatures w14:val="none"/>
         </w:rPr>
-        <w:t>Póliza del Seguro Vehicular asociado al crédito vehicular N° CCV****8280</w:t>
+        <w:t>Póliza del Seguro Vehicular asociado al crédito vehicular CCV****8280</w:t>
       </w:r>
       <w:r>
         <w:rPr>
@@ -2991,7 +2991,7 @@
           <w14:ligatures w14:val="none"/>
         </w:rPr>
         <w:lastRenderedPageBreak/>
-        <w:t>Seguro Vehicular asociado al crédito vehicular N° CCV****8280</w:t>
+        <w:t>Seguro Vehicular asociado al crédito vehicular CCV****8280</w:t>
       </w:r>
       <w:r>
         <w:rPr>
@@ -3107,7 +3107,7 @@
           <w:lang w:eastAsia="es-PE"/>
           <w14:ligatures w14:val="none"/>
         </w:rPr>
-        <w:t xml:space="preserve">RESOLUCIÓN DE LA SECRETARÍA TÉCNICA  </w:t>
+        <w:t xml:space="preserve">RESOLUCIÓN DE LA SECRETARÍA TÉCNICA </w:t>
       </w:r>
     </w:p>
     <w:p>
@@ -3320,7 +3320,7 @@
           <w:kern w:val="0"/>
           <w14:ligatures w14:val="none"/>
         </w:rPr>
-        <w:t>infracción a los artículos 18° y 19° de la Ley N° 29571, Código de Protección y Defensa del Consumidor</w:t>
+        <w:t>infracción a los artículos 18 y 19 de la Ley 29571, Código de Protección y Defensa del Consumidor</w:t>
       </w:r>
       <w:r>
         <w:rPr>
@@ -3386,7 +3386,7 @@
           <w:lang w:val="es-ES" w:eastAsia="es-ES"/>
           <w14:ligatures w14:val="none"/>
         </w:rPr>
-        <w:t>Póliza del Seguro Vehicular asociado al crédito vehicular N° CCV****8280,</w:t>
+        <w:t>Póliza del Seguro Vehicular asociado al crédito vehicular CCV****8280,</w:t>
       </w:r>
       <w:r>
         <w:rPr>
@@ -3440,7 +3440,7 @@
           <w:kern w:val="0"/>
           <w14:ligatures w14:val="none"/>
         </w:rPr>
-        <w:t>infracción a los artículos 18° y 19° de la Ley N° 29571, Código de Protección y Defensa del Consumidor</w:t>
+        <w:t>infracción a los artículos 18 y 19 de la Ley 29571, Código de Protección y Defensa del Consumidor</w:t>
       </w:r>
       <w:r>
         <w:rPr>
@@ -3526,7 +3526,7 @@
           <w:lang w:val="es-ES" w:eastAsia="es-ES"/>
           <w14:ligatures w14:val="none"/>
         </w:rPr>
-        <w:t>Póliza del Seguro Vehicular asociado al crédito vehicular N° CCV****8280</w:t>
+        <w:t>Póliza del Seguro Vehicular asociado al crédito vehicular CCV****8280</w:t>
       </w:r>
       <w:r>
         <w:rPr>
@@ -3581,7 +3581,7 @@
           <w:kern w:val="0"/>
           <w14:ligatures w14:val="none"/>
         </w:rPr>
-        <w:t>Presunta infracción a los artículos 18° y 19° de la Ley N° 29571, Código de Protección y Defensa del Consumidor</w:t>
+        <w:t>Presunta infracción a los artículos 18 y 19 de la Ley 29571, Código de Protección y Defensa del Consumidor</w:t>
       </w:r>
       <w:r>
         <w:rPr>
@@ -3676,7 +3676,7 @@
           <w:lang w:val="es-ES" w:eastAsia="es-ES"/>
           <w14:ligatures w14:val="none"/>
         </w:rPr>
-        <w:t>Póliza del Seguro Vehicular asociado al crédito vehicular N° CCV****8280</w:t>
+        <w:t>Póliza del Seguro Vehicular asociado al crédito vehicular CCV****8280</w:t>
       </w:r>
       <w:r>
         <w:rPr>
@@ -3775,7 +3775,7 @@
           <w:kern w:val="0"/>
           <w14:ligatures w14:val="none"/>
         </w:rPr>
-        <w:t>Presunta infracción a los artículos 18° y 19° de la Ley N° 29571, Código de Protección y Defensa del Consumidor</w:t>
+        <w:t>Presunta infracción a los artículos 18 y 19 de la Ley 29571, Código de Protección y Defensa del Consumidor</w:t>
       </w:r>
       <w:r>
         <w:rPr>
@@ -3839,7 +3839,7 @@
           <w:lang w:val="es-ES" w:eastAsia="es-ES"/>
           <w14:ligatures w14:val="none"/>
         </w:rPr>
-        <w:t>Póliza del Seguro Vehicular asociado al crédito vehicular N° CCV****8280</w:t>
+        <w:t>Póliza del Seguro Vehicular asociado al crédito vehicular CCV****8280</w:t>
       </w:r>
       <w:r>
         <w:rPr>
@@ -3893,7 +3893,7 @@
           <w:kern w:val="0"/>
           <w14:ligatures w14:val="none"/>
         </w:rPr>
-        <w:t xml:space="preserve">Presunta infracción al literal e) del artículo 47° de la Ley N° 29571, Código de Protección y Defensa del Consumidor, en tanto </w:t>
+        <w:t xml:space="preserve">Presunta infracción al literal e) del artículo 47 de la Ley 29571, Código de Protección y Defensa del Consumidor, en tanto </w:t>
       </w:r>
       <w:r>
         <w:rPr>
@@ -3943,7 +3943,7 @@
           <w:lang w:val="es-ES" w:eastAsia="es-ES"/>
           <w14:ligatures w14:val="none"/>
         </w:rPr>
-        <w:t>la Póliza del Seguro Vehicular asociado al crédito vehicular N° CCV****8280</w:t>
+        <w:t>la Póliza del Seguro Vehicular asociado al crédito vehicular CCV****8280</w:t>
       </w:r>
       <w:r>
         <w:rPr>
@@ -4276,7 +4276,7 @@
           <w:lang w:eastAsia="es-PE"/>
           <w14:ligatures w14:val="none"/>
         </w:rPr>
-        <w:t>°</w:t>
+        <w:t/>
       </w:r>
       <w:r>
         <w:rPr>
@@ -4354,7 +4354,7 @@
           <w:lang w:eastAsia="es-PE"/>
           <w14:ligatures w14:val="none"/>
         </w:rPr>
-        <w:t>°</w:t>
+        <w:t/>
       </w:r>
       <w:r>
         <w:rPr>
@@ -4548,7 +4548,7 @@
           <w:lang w:eastAsia="es-PE"/>
           <w14:ligatures w14:val="none"/>
         </w:rPr>
-        <w:t>°</w:t>
+        <w:t/>
       </w:r>
       <w:r>
         <w:rPr>
@@ -4706,7 +4706,7 @@
           <w:lang w:val="es-ES" w:eastAsia="es-ES"/>
           <w14:ligatures w14:val="none"/>
         </w:rPr>
-        <w:t>(i) presentar una copia debidamente suscrita de la Póliza del Seguro Vehicular asociado al crédito vehicular N° CCV****8280 materia de denuncia; (</w:t>
+        <w:t>(i) presentar una copia debidamente suscrita de la Póliza del Seguro Vehicular asociado al crédito vehicular CCV****8280 materia de denuncia; (</w:t>
       </w:r>
       <w:proofErr w:type="spellStart"/>
       <w:r>
@@ -4728,7 +4728,7 @@
           <w:lang w:val="es-ES" w:eastAsia="es-ES"/>
           <w14:ligatures w14:val="none"/>
         </w:rPr>
-        <w:t>) presentar los medios probatorios que acrediten que atendió oportunamente la solicitud de cancelación o sustitución de la Póliza del Seguro Vehicular asociado al crédito vehicular N° CCV****8280; y, (</w:t>
+        <w:t>) presentar los medios probatorios que acrediten que atendió oportunamente la solicitud de cancelación o sustitución de la Póliza del Seguro Vehicular asociado al crédito vehicular CCV****8280; y, (</w:t>
       </w:r>
       <w:proofErr w:type="spellStart"/>
       <w:r>
@@ -4867,7 +4867,7 @@
           <w:lang w:val="es-ES" w:eastAsia="es-ES"/>
           <w14:ligatures w14:val="none"/>
         </w:rPr>
-        <w:t>(i) presentar una copia debidamente suscrita de la Póliza del Seguro Vehicular asociado al crédito vehicular N° CCV****8280 materia de denuncia; (</w:t>
+        <w:t>(i) presentar una copia debidamente suscrita de la Póliza del Seguro Vehicular asociado al crédito vehicular CCV****8280 materia de denuncia; (</w:t>
       </w:r>
       <w:proofErr w:type="spellStart"/>
       <w:r>
@@ -4889,7 +4889,7 @@
           <w:lang w:val="es-ES" w:eastAsia="es-ES"/>
           <w14:ligatures w14:val="none"/>
         </w:rPr>
-        <w:t>) presentar los medios probatorios que acrediten que gestionó oportunamente la solicitud de cancelación o sustitución de la Póliza del Seguro Vehicular asociado al crédito vehicular N° CCV****8280 y, (</w:t>
+        <w:t>) presentar los medios probatorios que acrediten que gestionó oportunamente la solicitud de cancelación o sustitución de la Póliza del Seguro Vehicular asociado al crédito vehicular CCV****8280 y, (</w:t>
       </w:r>
       <w:proofErr w:type="spellStart"/>
       <w:r>
@@ -4990,7 +4990,7 @@
           <w:lang w:eastAsia="es-PE"/>
           <w14:ligatures w14:val="none"/>
         </w:rPr>
-        <w:t>°</w:t>
+        <w:t/>
       </w:r>
       <w:r>
         <w:rPr>
@@ -5010,7 +5010,7 @@
           <w:lang w:eastAsia="es-PE"/>
           <w14:ligatures w14:val="none"/>
         </w:rPr>
-        <w:t>Ley N° 29571</w:t>
+        <w:t>Ley 29571</w:t>
       </w:r>
       <w:r>
         <w:rPr>
@@ -5062,7 +5062,7 @@
           <w:lang w:eastAsia="es-PE"/>
           <w14:ligatures w14:val="none"/>
         </w:rPr>
-        <w:t>°</w:t>
+        <w:t/>
       </w:r>
       <w:r>
         <w:rPr>
@@ -5082,7 +5082,7 @@
           <w:lang w:eastAsia="es-PE"/>
           <w14:ligatures w14:val="none"/>
         </w:rPr>
-        <w:t>°</w:t>
+        <w:t/>
       </w:r>
       <w:r>
         <w:rPr>
@@ -5102,7 +5102,7 @@
           <w:lang w:eastAsia="es-PE"/>
           <w14:ligatures w14:val="none"/>
         </w:rPr>
-        <w:t>°</w:t>
+        <w:t/>
       </w:r>
       <w:r>
         <w:rPr>
@@ -5154,7 +5154,7 @@
           <w:lang w:eastAsia="es-PE"/>
           <w14:ligatures w14:val="none"/>
         </w:rPr>
-        <w:t>°</w:t>
+        <w:t/>
       </w:r>
       <w:r>
         <w:rPr>
@@ -5241,7 +5241,7 @@
           <w:lang w:eastAsia="es-PE"/>
           <w14:ligatures w14:val="none"/>
         </w:rPr>
-        <w:t>°</w:t>
+        <w:t/>
       </w:r>
       <w:r>
         <w:rPr>
@@ -5316,7 +5316,7 @@
           <w:lang w:eastAsia="es-PE"/>
           <w14:ligatures w14:val="none"/>
         </w:rPr>
-        <w:t>°</w:t>
+        <w:t/>
       </w:r>
       <w:r>
         <w:rPr>
@@ -5324,7 +5324,7 @@
           <w:kern w:val="0"/>
           <w14:ligatures w14:val="none"/>
         </w:rPr>
-        <w:t xml:space="preserve"> del Decreto Legislativo N° 807</w:t>
+        <w:t xml:space="preserve"> del Decreto Legislativo 807</w:t>
       </w:r>
       <w:r>
         <w:rPr>
@@ -5631,7 +5631,7 @@
           <w:lang w:eastAsia="es-PE"/>
           <w14:ligatures w14:val="none"/>
         </w:rPr>
-        <w:t>°</w:t>
+        <w:t/>
       </w:r>
       <w:r>
         <w:rPr>
@@ -5655,7 +5655,7 @@
           <w:lang w:eastAsia="es-PE"/>
           <w14:ligatures w14:val="none"/>
         </w:rPr>
-        <w:t>°</w:t>
+        <w:t/>
       </w:r>
       <w:r>
         <w:rPr>
@@ -5919,7 +5919,7 @@
           <w:color w:val="000000"/>
           <w:lang w:eastAsia="es-PE"/>
         </w:rPr>
-        <w:t>Comisión de Protección al Consumidor N°1</w:t>
+        <w:t>Comisión de Protección al Consumidor 1</w:t>
       </w:r>
     </w:p>
     <w:p>
@@ -6186,7 +6186,7 @@
           <w:sz w:val="14"/>
           <w:szCs w:val="14"/>
         </w:rPr>
-        <w:t xml:space="preserve">  </w:t>
+        <w:t xml:space="preserve"> </w:t>
       </w:r>
       <w:r>
         <w:rPr>
@@ -6204,7 +6204,7 @@
           <w:sz w:val="14"/>
           <w:szCs w:val="14"/>
         </w:rPr>
-        <w:t>LEY N° 29571, CÓDIGO DE PROTECCIÓN Y DEFENSA DEL CONSUMIDOR, publicado el 2 de setiembre de 2010 y modificado por Decreto Legislativo N° 1308</w:t>
+        <w:t>LEY 29571, CÓDIGO DE PROTECCIÓN Y DEFENSA DEL CONSUMIDOR, publicado el 2 de setiembre de 2010 y modificado por Decreto Legislativo 1308</w:t>
       </w:r>
     </w:p>
     <w:p>
@@ -6272,7 +6272,7 @@
           <w:sz w:val="14"/>
           <w:szCs w:val="14"/>
         </w:rPr>
-        <w:t>El Instituto Nacional de Defensa de la Competencia y de la Protección de la Propiedad Intelectual (Indecopi) es la autoridad con competencia primaria y de alcance nacional para conocer las presuntas infracciones a las disposiciones contenidas en el presente Código, así como para imponer las sanciones y medidas correctivas establecidas en el presente capítulo, conforme al Decreto Legislativo N° 1033, Ley de Organización y Funciones del Indecopi. Dicha competencia solo puede ser negada cuando ella haya sido asignada o se asigne a favor de otro organismo por norma expresa con rango de ley.</w:t>
+        <w:t>El Instituto Nacional de Defensa de la Competencia y de la Protección de la Propiedad Intelectual (Indecopi) es la autoridad con competencia primaria y de alcance nacional para conocer las presuntas infracciones a las disposiciones contenidas en el presente Código, así como para imponer las sanciones y medidas correctivas establecidas en el presente capítulo, conforme al Decreto Legislativo 1033, Ley de Organización y Funciones del Indecopi. Dicha competencia solo puede ser negada cuando ella haya sido asignada o se asigne a favor de otro organismo por norma expresa con rango de ley.</w:t>
       </w:r>
     </w:p>
     <w:p>
@@ -6355,7 +6355,7 @@
           <w:sz w:val="14"/>
           <w:szCs w:val="14"/>
         </w:rPr>
-        <w:t>LEY DE ORGANIZACIÓN Y FUNCIONES DEL INDECOPI, APROBADA POR DECRETO LEGISLATIVO N° 1033</w:t>
+        <w:t>LEY DE ORGANIZACIÓN Y FUNCIONES DEL INDECOPI, APROBADA POR DECRETO LEGISLATIVO 1033</w:t>
       </w:r>
     </w:p>
     <w:p>
@@ -6480,7 +6480,7 @@
           <w:sz w:val="14"/>
           <w:szCs w:val="14"/>
         </w:rPr>
-        <w:t xml:space="preserve">           </w:t>
+        <w:t xml:space="preserve"> </w:t>
       </w:r>
       <w:r>
         <w:rPr>
@@ -6498,7 +6498,7 @@
           <w:sz w:val="14"/>
           <w:szCs w:val="14"/>
         </w:rPr>
-        <w:t>LEY N° 29571, CÓDIGO DE PROTECCIÓN Y DEFENSA DEL CONSUMIDOR, publicado el 2 de setiembre de 2010 y modificado por Decreto Legislativo N° 1308</w:t>
+        <w:t>LEY 29571, CÓDIGO DE PROTECCIÓN Y DEFENSA DEL CONSUMIDOR, publicado el 2 de setiembre de 2010 y modificado por Decreto Legislativo 1308</w:t>
       </w:r>
     </w:p>
     <w:p>
@@ -6663,7 +6663,7 @@
           <w:sz w:val="14"/>
           <w:szCs w:val="14"/>
         </w:rPr>
-        <w:t xml:space="preserve">           </w:t>
+        <w:t xml:space="preserve"> </w:t>
       </w:r>
       <w:r>
         <w:rPr>
@@ -6681,7 +6681,7 @@
           <w:sz w:val="14"/>
           <w:szCs w:val="14"/>
         </w:rPr>
-        <w:t>LEY N° 29571, CÓDIGO DE PROTECCIÓN Y DEFENSA DEL CONSUMIDOR, publicado el 2 de setiembre de 2010 y modificado por Decreto Legislativo N° 1308</w:t>
+        <w:t>LEY 29571, CÓDIGO DE PROTECCIÓN Y DEFENSA DEL CONSUMIDOR, publicado el 2 de setiembre de 2010 y modificado por Decreto Legislativo 1308</w:t>
       </w:r>
     </w:p>
     <w:p>
@@ -6810,7 +6810,7 @@
           <w:sz w:val="14"/>
           <w:szCs w:val="14"/>
         </w:rPr>
-        <w:t xml:space="preserve">  </w:t>
+        <w:t xml:space="preserve"> </w:t>
       </w:r>
       <w:r>
         <w:rPr>
@@ -6828,7 +6828,7 @@
           <w:sz w:val="14"/>
           <w:szCs w:val="14"/>
         </w:rPr>
-        <w:t>LEY SOBRE FACULTADES, NORMAS Y ORGANIZACIÓN DEL INDECOPI, APROBADA POR DECRETO LEGISLATIVO N° 807 Artículo 24.-</w:t>
+        <w:t>LEY SOBRE FACULTADES, NORMAS Y ORGANIZACIÓN DEL INDECOPI, APROBADA POR DECRETO LEGISLATIVO 807 Artículo 24.-</w:t>
       </w:r>
       <w:r>
         <w:rPr>
@@ -7015,7 +7015,7 @@
           <w:szCs w:val="14"/>
         </w:rPr>
         <w:tab/>
-        <w:t>El número de trabajadores se atenderá siempre que la empresa haya sido constituida antes de la vigencia de la Ley Nº 30056, publicada el 2 de julio de 2013, que modificó el artículo 5 del Texto Único Ordenado de la Ley de Promoción de la Competitividad, Formalización y Desarrollo de la Micro y Pequeña Empresa y de Acceso al Empleo Decente (LEY MYPE). Ello, en la medida que la Tercera Disposición Complementaria Transitoria de la norma modificatoria precisa que las empresas constituidas antes de la entrada en vigencia de dicha Ley se rigen por los requisitos de acogimiento al régimen de las micro y pequeñas empresas regulados en el Decreto Legislativo 1086.</w:t>
+        <w:t>El número de trabajadores se atenderá siempre que la empresa haya sido constituida antes de la vigencia de la Ley 30056, publicada el 2 de julio de 2013, que modificó el artículo 5 del Texto Único Ordenado de la Ley de Promoción de la Competitividad, Formalización y Desarrollo de la Micro y Pequeña Empresa y de Acceso al Empleo Decente (LEY MYPE). Ello, en la medida que la Tercera Disposición Complementaria Transitoria de la norma modificatoria precisa que las empresas constituidas antes de la entrada en vigencia de dicha Ley se rigen por los requisitos de acogimiento al régimen de las micro y pequeñas empresas regulados en el Decreto Legislativo 1086.</w:t>
       </w:r>
     </w:p>
     <w:p>
@@ -7093,7 +7093,7 @@
           <w:sz w:val="14"/>
           <w:szCs w:val="14"/>
         </w:rPr>
-        <w:t>N° 29571</w:t>
+        <w:t>29571</w:t>
       </w:r>
       <w:r>
         <w:rPr>
@@ -7121,7 +7121,7 @@
           <w:sz w:val="14"/>
           <w:szCs w:val="14"/>
         </w:rPr>
-        <w:t>publicado el 2 de setiembre de 2010 y modificado por Decreto Legislativo N° 1308</w:t>
+        <w:t>publicado el 2 de setiembre de 2010 y modificado por Decreto Legislativo 1308</w:t>
       </w:r>
     </w:p>
     <w:p>
@@ -7270,7 +7270,7 @@
           <w:szCs w:val="14"/>
           <w:vertAlign w:val="superscript"/>
         </w:rPr>
-        <w:t xml:space="preserve">  </w:t>
+        <w:t xml:space="preserve"> </w:t>
       </w:r>
       <w:r>
         <w:rPr>
@@ -7278,7 +7278,7 @@
           <w:sz w:val="14"/>
           <w:szCs w:val="14"/>
         </w:rPr>
-        <w:t xml:space="preserve">     </w:t>
+        <w:t xml:space="preserve"> </w:t>
       </w:r>
       <w:r>
         <w:rPr>
@@ -7313,7 +7313,7 @@
           <w:sz w:val="14"/>
           <w:szCs w:val="14"/>
         </w:rPr>
-        <w:t>N° 29571</w:t>
+        <w:t>29571</w:t>
       </w:r>
       <w:r>
         <w:rPr>
@@ -7341,7 +7341,7 @@
           <w:sz w:val="14"/>
           <w:szCs w:val="14"/>
         </w:rPr>
-        <w:t>publicado el 2 de setiembre de 2010 y modificado por Decreto Legislativo N° 1308</w:t>
+        <w:t>publicado el 2 de setiembre de 2010 y modificado por Decreto Legislativo 1308</w:t>
       </w:r>
     </w:p>
     <w:p>
@@ -7383,7 +7383,7 @@
           <w:sz w:val="14"/>
           <w:szCs w:val="14"/>
         </w:rPr>
-        <w:t>El órgano resolutivo puede sancionar las infracciones administrativas a que se refiere el artículo 108º con amonestación y multas de hasta cuatrocientos cincuenta (450) Unidades Impositivas Tributarias (UIT), las cuales son calificadas de la siguiente manera:</w:t>
+        <w:t>El órgano resolutivo puede sancionar las infracciones administrativas a que se refiere el artículo 108 con amonestación y multas de hasta cuatrocientos cincuenta (450) Unidades Impositivas Tributarias (UIT), las cuales son calificadas de la siguiente manera:</w:t>
       </w:r>
     </w:p>
     <w:p>
@@ -7519,7 +7519,7 @@
           <w:sz w:val="14"/>
           <w:szCs w:val="14"/>
         </w:rPr>
-        <w:t xml:space="preserve">        </w:t>
+        <w:t xml:space="preserve"> </w:t>
       </w:r>
       <w:r>
         <w:rPr>
@@ -7537,7 +7537,7 @@
           <w:sz w:val="14"/>
           <w:szCs w:val="14"/>
         </w:rPr>
-        <w:t>LEY N° 29571, CÓDIGO DE PROTECCIÓN Y DEFENSA DEL CONSUMIDOR, publicado el 2 de setiembre de 2010 y modificado por Decreto Legislativo N° 1308</w:t>
+        <w:t>LEY 29571, CÓDIGO DE PROTECCIÓN Y DEFENSA DEL CONSUMIDOR, publicado el 2 de setiembre de 2010 y modificado por Decreto Legislativo 1308</w:t>
       </w:r>
     </w:p>
     <w:p>
@@ -8346,7 +8346,7 @@
           <w:sz w:val="14"/>
           <w:szCs w:val="14"/>
         </w:rPr>
-        <w:t xml:space="preserve">         </w:t>
+        <w:t xml:space="preserve"> </w:t>
       </w:r>
       <w:r>
         <w:rPr>
@@ -8381,7 +8381,7 @@
           <w:sz w:val="14"/>
           <w:szCs w:val="14"/>
         </w:rPr>
-        <w:t>N° 29571</w:t>
+        <w:t>29571</w:t>
       </w:r>
       <w:r>
         <w:rPr>
@@ -8409,7 +8409,7 @@
           <w:sz w:val="14"/>
           <w:szCs w:val="14"/>
         </w:rPr>
-        <w:t>publicado el 2 de setiembre de 2010 y modificado por Decreto Legislativo N° 1308</w:t>
+        <w:t>publicado el 2 de setiembre de 2010 y modificado por Decreto Legislativo 1308</w:t>
       </w:r>
     </w:p>
     <w:p>
@@ -8635,7 +8635,7 @@
           <w:szCs w:val="14"/>
         </w:rPr>
         <w:tab/>
-        <w:t>DECRETO LEGISLATIVO Nº 807, LEY SOBRE FACULTADES, NORMAS Y ORGANIZACIÓN DEL INDECOPI FACULTADES DE LAS COMISIONES Y OFICINAS DEL INDECOPI</w:t>
+        <w:t>DECRETO LEGISLATIVO 807, LEY SOBRE FACULTADES, NORMAS Y ORGANIZACIÓN DEL INDECOPI FACULTADES DE LAS COMISIONES Y OFICINAS DEL INDECOPI</w:t>
       </w:r>
     </w:p>
     <w:p>
@@ -9088,7 +9088,7 @@
               <w:sz w:val="16"/>
               <w:szCs w:val="16"/>
             </w:rPr>
-            <w:t xml:space="preserve">CNICA DE LA    </w:t>
+            <w:t xml:space="preserve">CNICA DE LA </w:t>
           </w:r>
         </w:p>
         <w:p>

</xml_diff>